<commit_message>
v4 round 4: fig4 back to 4 bias-affected models; Mistral sweep joins fig6 (1x3) and fig7 (7 curves); changes.docx captions refreshed
</commit_message>
<xml_diff>
--- a/changes.docx
+++ b/changes.docx
@@ -6025,7 +6025,7 @@
                 <w:sz w:val="19"/>
                 <w:szCs w:val="19"/>
               </w:rPr>
-              <w:t>Recall–specificity slopegraphs now for all seven models (2×4 grid; the eighth cell holds the legend). EGCD coincides with greedy wherever the gate does not fire.</w:t>
+              <w:t>Recall–specificity slopegraphs back to the focused set: the four bias-affected models (2×2 grid). On the sound models the gate is essentially inactive at τ*, so EGCD's operating point is already the greedy one and no trade-off arises; those live in Figure 6.</w:t>
             </w:r>
           </w:p>
         </w:tc>
@@ -6221,7 +6221,7 @@
                 <w:sz w:val="19"/>
                 <w:szCs w:val="19"/>
               </w:rPr>
-              <w:t>Same sweep for the sound models: Idefics2-8B (flat within a 0.7-point band) and LLaVA-1.5-7B (returns exactly to its baseline at τ*). Mistral-7B has no tuning-half sweep and is intentionally absent.</w:t>
+              <w:t>Same sweep, now all three sound models — Idefics2-8B, LLaVA-1.5-7B and LLaVA-v1.6-Mistral-7B (1×3). Mistral's panel is the earlier full-set sweep; its curve merges with greedy from τ = 0.71 onward.</w:t>
             </w:r>
           </w:p>
         </w:tc>
@@ -6319,7 +6319,7 @@
                 <w:sz w:val="19"/>
                 <w:szCs w:val="19"/>
               </w:rPr>
-              <w:t>Single-panel robustness view: gain over greedy vs. τ for six models, direct-labelled curves, stars at τ*. Replaces the earlier 2×3 duplicate of Figures 5–6.</w:t>
+              <w:t>Single-panel robustness view: gain over greedy vs. τ for all seven models, direct-labelled curves, stars at τ*. Replaces the earlier 2×3 duplicate of Figures 5–6.</w:t>
             </w:r>
           </w:p>
         </w:tc>
@@ -6714,7 +6714,7 @@
         <w:rPr>
           <w:b w:val="0"/>
         </w:rPr>
-        <w:t>Recall and Specificity on the held-out half for all seven models, one panel per model. Universal CD+APC reaches its recall by spending specificity — catastrophically so on LLaVA-1.5-7B — whereas EGCD recovers most of the recall at a fraction of the specificity cost. Wherever the entropy gate does not fire, EGCD's operating point coincides exactly with greedy decoding; on Qwen2-VL-2B the VCD, SID and greedy points also coincide. The LLaVA-v1.6-Mistral-7B panel uses the earlier full-set run (re-run pending).</w:t>
+        <w:t>Recall and Specificity on the held-out half for the four bias-affected models, one panel per model — the architectures where the gate fires on part of the queries and EGCD actively re-places the operating point. Universal CD+APC reaches its recall by spending specificity, whereas EGCD recovers most of the recall at a fraction of the specificity cost. Wherever the gate does not fire, EGCD's operating point coincides exactly with greedy decoding; on Qwen2-VL-2B the VCD, SID and greedy points also coincide. The three sound models are not shown: at the selected threshold their gate is essentially inactive, their operating point already sits on the greedy one, and there is no recall–specificity trade-off to manage; they are covered by Figure 6.</w:t>
       </w:r>
     </w:p>
     <w:p>
@@ -6766,7 +6766,7 @@
         <w:rPr>
           <w:b w:val="0"/>
         </w:rPr>
-        <w:t>The same sweep for the structurally sound models. Idefics2-8B stays within a 0.7-point band across the entire range, and LLaVA-1.5-7B returns exactly to its baseline at the selected threshold, with the gate firing on none of the held-out queries. LLaVA-v1.6-Mistral-7B is absent because no tuning-half sweep exists for it: its rows come from the earlier full-set run at the suite threshold, and it will join this figure once its re-run lands.</w:t>
+        <w:t>The same sweep for the three structurally sound models. Idefics2-8B stays within a 0.7-point band across the entire range, and LLaVA-1.5-7B returns exactly to its baseline at the selected threshold, with the gate firing on none of the held-out queries. LLaVA-v1.6-Mistral-7B completes the set: its curve climbs from the gate-always-active regime to its baseline and coincides with greedy decoding from τ = 0.71 onward — exactly where its selected threshold sits — so on a sound model EGCD neither gains nor loses, while universal CD+APC gives up 10.4 points on it. The Idefics2 and LLaVA-1.5 sweeps are tuning-half; the Mistral sweep is the earlier full-set run, whose baseline and CD+APC rows match the main table.</w:t>
       </w:r>
     </w:p>
     <w:p>
@@ -6792,7 +6792,7 @@
         <w:rPr>
           <w:b w:val="0"/>
         </w:rPr>
-        <w:t>Gain over greedy decoding across the entropy-threshold sweep on the tuning half for six of the seven models, one directly labelled curve per model; stars mark each model's selected threshold τ*. Every curve returns to zero as τ grows — where the gate no longer fires, EGCD is exactly greedy decoding. The complete grid is tabulated in Appendix A; LLaVA-v1.6-Mistral-7B is omitted for lack of a tuning-half sweep.</w:t>
+        <w:t>Gain over greedy decoding across the entropy-threshold sweep for all seven models, one directly labelled curve per model; stars mark each model's selected threshold τ*. Every curve returns to zero as τ grows — where the gate no longer fires, EGCD is exactly greedy decoding — and on the sound models a loose threshold is actively harmful (down to −14 points on LLaVA-1.5-7B and −8.7 on LLaVA-v1.6-Mistral-7B), which is precisely what the gate prevents. The six tuning-half sweeps are tabulated in Appendix A; the LLaVA-v1.6-Mistral-7B curve is the earlier full-set run.</w:t>
       </w:r>
     </w:p>
     <w:p>

</xml_diff>